<commit_message>
docs: adaptar manual de tres roles al ejemplo de Yumpu
</commit_message>
<xml_diff>
--- a/docs/manual-usuario/Manual_usuario_Rama_Daniela.docx
+++ b/docs/manual-usuario/Manual_usuario_Rama_Daniela.docx
@@ -3,10 +3,13 @@
 <w:document xmlns:wpc="http://schemas.microsoft.com/office/word/2010/wordprocessingCanvas" xmlns:mo="http://schemas.microsoft.com/office/mac/office/2008/main" xmlns:mc="http://schemas.openxmlformats.org/markup-compatibility/2006" xmlns:mv="urn:schemas-microsoft-com:mac:vml" xmlns:o="urn:schemas-microsoft-com:office:office" xmlns:r="http://schemas.openxmlformats.org/officeDocument/2006/relationships" xmlns:m="http://schemas.openxmlformats.org/officeDocument/2006/math" xmlns:v="urn:schemas-microsoft-com:vml" xmlns:wp14="http://schemas.microsoft.com/office/word/2010/wordprocessingDrawing" xmlns:wp="http://schemas.openxmlformats.org/drawingml/2006/wordprocessingDrawing" xmlns:w10="urn:schemas-microsoft-com:office:word" xmlns:w="http://schemas.openxmlformats.org/wordprocessingml/2006/main" xmlns:w14="http://schemas.microsoft.com/office/word/2010/wordml" xmlns:wpg="http://schemas.microsoft.com/office/word/2010/wordprocessingGroup" xmlns:wpi="http://schemas.microsoft.com/office/word/2010/wordprocessingInk" xmlns:wne="http://schemas.microsoft.com/office/word/2006/wordml" xmlns:wps="http://schemas.microsoft.com/office/word/2010/wordprocessingShape" mc:Ignorable="w14 wp14">
   <w:body>
     <w:p>
+      <w:pPr>
+        <w:jc w:val="center"/>
+      </w:pPr>
       <w:r>
         <w:drawing>
           <wp:inline xmlns:a="http://schemas.openxmlformats.org/drawingml/2006/main" xmlns:pic="http://schemas.openxmlformats.org/drawingml/2006/picture">
-            <wp:extent cx="1143000" cy="1172010"/>
+            <wp:extent cx="1508760" cy="1547053"/>
             <wp:docPr id="1" name="Picture 1"/>
             <wp:cNvGraphicFramePr>
               <a:graphicFrameLocks noChangeAspect="1"/>
@@ -27,7 +30,7 @@
                   <pic:spPr>
                     <a:xfrm>
                       <a:off x="0" y="0"/>
-                      <a:ext cx="1143000" cy="1172010"/>
+                      <a:ext cx="1508760" cy="1547053"/>
                     </a:xfrm>
                     <a:prstGeom prst="rect"/>
                   </pic:spPr>
@@ -41,38 +44,54 @@
     <w:p>
       <w:pPr>
         <w:pStyle w:val="Title"/>
+        <w:jc w:val="center"/>
       </w:pPr>
       <w:r>
-        <w:t>EXPLORA</w:t>
-        <w:br/>
-        <w:t>CANDELARIA</w:t>
+        <w:t>EXPLORA CANDELARIA</w:t>
       </w:r>
     </w:p>
     <w:p>
       <w:pPr>
-        <w:pStyle w:val="Subtitle"/>
+        <w:pStyle w:val="Title"/>
+        <w:jc w:val="center"/>
       </w:pPr>
       <w:r>
-        <w:t>Manual de usuario</w:t>
-      </w:r>
-    </w:p>
-    <w:p>
-      <w:r>
-        <w:t>Sistema de reservas turísticas</w:t>
-        <w:br/>
-        <w:t>Turista · Administrador · Emprendimiento</w:t>
-      </w:r>
-    </w:p>
-    <w:p>
+        <w:t>Manual de Usuario</w:t>
+      </w:r>
+    </w:p>
+    <w:p>
+      <w:pPr>
+        <w:jc w:val="center"/>
+      </w:pPr>
+      <w:r>
+        <w:rPr>
+          <w:i/>
+        </w:rPr>
+        <w:t>Descubre, reserva y vive La Candelaria.</w:t>
+      </w:r>
+    </w:p>
+    <w:p/>
+    <w:p>
+      <w:pPr>
+        <w:jc w:val="center"/>
+      </w:pPr>
+      <w:r>
+        <w:t>Guía para turistas, administradores y emprendedores</w:t>
+      </w:r>
+    </w:p>
+    <w:p>
+      <w:pPr>
+        <w:jc w:val="center"/>
+      </w:pPr>
       <w:r>
         <w:t>Basado en Rama-Daniela</w:t>
         <w:br/>
-        <w:t>Edición 1.0 · 8 de octubre de 2026</w:t>
-      </w:r>
-    </w:p>
-    <w:p>
-      <w:r>
-        <w:t>Guía de uso con capturas reales y espacios descritos para las imágenes pendientes. Las pantallas utilizan datos ficticios de demostración.</w:t>
+        <w:t>Edición 2.0 · 9 de octubre de 2026</w:t>
+      </w:r>
+    </w:p>
+    <w:p>
+      <w:r>
+        <w:t>Diseño adaptado del ejemplo de manual de Yumpu facilitado por el usuario. Las capturas utilizan datos ficticios de demostración.</w:t>
       </w:r>
     </w:p>
     <w:p>
@@ -93,22 +112,7 @@
         <w:pStyle w:val="Heading2"/>
       </w:pPr>
       <w:r>
-        <w:t>1. Introducción y acceso</w:t>
-      </w:r>
-    </w:p>
-    <w:p>
-      <w:r>
-        <w:t>1.1. Identificar tu rol</w:t>
-      </w:r>
-    </w:p>
-    <w:p>
-      <w:r>
-        <w:t>1.2. Iniciar y cerrar sesión</w:t>
-      </w:r>
-    </w:p>
-    <w:p>
-      <w:r>
-        <w:t>1.3. Recuperar la contraseña</w:t>
+        <w:t>¿Qué es Explora Candelaria?</w:t>
       </w:r>
     </w:p>
     <w:p>
@@ -116,47 +120,12 @@
         <w:pStyle w:val="Heading2"/>
       </w:pPr>
       <w:r>
-        <w:t>2. Manual del turista</w:t>
-      </w:r>
-    </w:p>
-    <w:p>
-      <w:r>
-        <w:t>2.1. Crear y confirmar una cuenta</w:t>
-      </w:r>
-    </w:p>
-    <w:p>
-      <w:r>
-        <w:t>2.2. Consultar sitios, actividades y festividades</w:t>
-      </w:r>
-    </w:p>
-    <w:p>
-      <w:r>
-        <w:t>2.3. Consultar el mapa turístico</w:t>
-      </w:r>
-    </w:p>
-    <w:p>
-      <w:r>
-        <w:t>2.4. Buscar emprendimientos y servicios</w:t>
-      </w:r>
-    </w:p>
-    <w:p>
-      <w:r>
-        <w:t>2.5. Seleccionar fechas y preparar el carrito</w:t>
-      </w:r>
-    </w:p>
-    <w:p>
-      <w:r>
-        <w:t>2.6. Enviar la solicitud de reserva</w:t>
-      </w:r>
-    </w:p>
-    <w:p>
-      <w:r>
-        <w:t>2.7. Consultar reservas y enviar un comprobante</w:t>
-      </w:r>
-    </w:p>
-    <w:p>
-      <w:r>
-        <w:t>2.8. Cancelar una reserva</w:t>
+        <w:t>Características del sistema</w:t>
+      </w:r>
+    </w:p>
+    <w:p>
+      <w:r>
+        <w:t>Funciones disponibles</w:t>
       </w:r>
     </w:p>
     <w:p>
@@ -164,47 +133,22 @@
         <w:pStyle w:val="Heading2"/>
       </w:pPr>
       <w:r>
-        <w:t>3. Manual del administrador</w:t>
-      </w:r>
-    </w:p>
-    <w:p>
-      <w:r>
-        <w:t>3.1. Consultar el panel administrativo</w:t>
-      </w:r>
-    </w:p>
-    <w:p>
-      <w:r>
-        <w:t>3.2. Registrar un emprendimiento</w:t>
-      </w:r>
-    </w:p>
-    <w:p>
-      <w:r>
-        <w:t>3.3. Buscar, editar y cambiar el estado de un emprendimiento</w:t>
-      </w:r>
-    </w:p>
-    <w:p>
-      <w:r>
-        <w:t>3.4. Administrar sitios turísticos</w:t>
-      </w:r>
-    </w:p>
-    <w:p>
-      <w:r>
-        <w:t>3.5. Administrar actividades turísticas</w:t>
-      </w:r>
-    </w:p>
-    <w:p>
-      <w:r>
-        <w:t>3.6. Administrar festividades y su programación</w:t>
-      </w:r>
-    </w:p>
-    <w:p>
-      <w:r>
-        <w:t>3.7. Consultar y descargar reportes administrativos</w:t>
-      </w:r>
-    </w:p>
-    <w:p>
-      <w:r>
-        <w:t>3.8. Consideraciones sobre la gestión de usuarios</w:t>
+        <w:t>Guía de uso · 1. Introducción y acceso</w:t>
+      </w:r>
+    </w:p>
+    <w:p>
+      <w:r>
+        <w:t>1.1. Identificar tu rol</w:t>
+      </w:r>
+    </w:p>
+    <w:p>
+      <w:r>
+        <w:t>1.2. Iniciar y cerrar sesión</w:t>
+      </w:r>
+    </w:p>
+    <w:p>
+      <w:r>
+        <w:t>1.3. Recuperar la contraseña</w:t>
       </w:r>
     </w:p>
     <w:p>
@@ -212,52 +156,47 @@
         <w:pStyle w:val="Heading2"/>
       </w:pPr>
       <w:r>
-        <w:t>4. Manual del emprendimiento</w:t>
-      </w:r>
-    </w:p>
-    <w:p>
-      <w:r>
-        <w:t>4.1. Consultar el panel del emprendimiento</w:t>
-      </w:r>
-    </w:p>
-    <w:p>
-      <w:r>
-        <w:t>4.2. Configurar los tipos de servicio</w:t>
-      </w:r>
-    </w:p>
-    <w:p>
-      <w:r>
-        <w:t>4.3. Crear servicios por categoría</w:t>
-      </w:r>
-    </w:p>
-    <w:p>
-      <w:r>
-        <w:t>4.4. Editar servicios y gestionar imágenes</w:t>
-      </w:r>
-    </w:p>
-    <w:p>
-      <w:r>
-        <w:t>4.5. Revisar solicitudes y confirmar reservas</w:t>
-      </w:r>
-    </w:p>
-    <w:p>
-      <w:r>
-        <w:t>4.6. Revisar pagos y reagendar</w:t>
-      </w:r>
-    </w:p>
-    <w:p>
-      <w:r>
-        <w:t>4.7. Crear una reserva para un turista registrado</w:t>
-      </w:r>
-    </w:p>
-    <w:p>
-      <w:r>
-        <w:t>4.8. Consultar y descargar reportes del emprendimiento</w:t>
-      </w:r>
-    </w:p>
-    <w:p>
-      <w:r>
-        <w:t>4.9. Actualizar el perfil y las cuentas bancarias</w:t>
+        <w:t>Guía de uso · 2. Manual del turista</w:t>
+      </w:r>
+    </w:p>
+    <w:p>
+      <w:r>
+        <w:t>2.1. Crear y confirmar una cuenta</w:t>
+      </w:r>
+    </w:p>
+    <w:p>
+      <w:r>
+        <w:t>2.2. Consultar sitios, actividades y festividades</w:t>
+      </w:r>
+    </w:p>
+    <w:p>
+      <w:r>
+        <w:t>2.3. Consultar el mapa turístico</w:t>
+      </w:r>
+    </w:p>
+    <w:p>
+      <w:r>
+        <w:t>2.4. Buscar emprendimientos y servicios</w:t>
+      </w:r>
+    </w:p>
+    <w:p>
+      <w:r>
+        <w:t>2.5. Seleccionar fechas y preparar el carrito</w:t>
+      </w:r>
+    </w:p>
+    <w:p>
+      <w:r>
+        <w:t>2.6. Enviar la solicitud de reserva</w:t>
+      </w:r>
+    </w:p>
+    <w:p>
+      <w:r>
+        <w:t>2.7. Consultar reservas y enviar un comprobante</w:t>
+      </w:r>
+    </w:p>
+    <w:p>
+      <w:r>
+        <w:t>2.8. Cancelar una reserva</w:t>
       </w:r>
     </w:p>
     <w:p>
@@ -265,12 +204,47 @@
         <w:pStyle w:val="Heading2"/>
       </w:pPr>
       <w:r>
-        <w:t>5. Configuración de la cuenta y ayuda</w:t>
-      </w:r>
-    </w:p>
-    <w:p>
-      <w:r>
-        <w:t>5.1. Mantener tu perfil y proteger el acceso</w:t>
+        <w:t>Guía de uso · 3. Manual del administrador</w:t>
+      </w:r>
+    </w:p>
+    <w:p>
+      <w:r>
+        <w:t>3.1. Consultar el panel administrativo</w:t>
+      </w:r>
+    </w:p>
+    <w:p>
+      <w:r>
+        <w:t>3.2. Registrar un emprendimiento</w:t>
+      </w:r>
+    </w:p>
+    <w:p>
+      <w:r>
+        <w:t>3.3. Buscar, editar y cambiar el estado de un emprendimiento</w:t>
+      </w:r>
+    </w:p>
+    <w:p>
+      <w:r>
+        <w:t>3.4. Administrar sitios turísticos</w:t>
+      </w:r>
+    </w:p>
+    <w:p>
+      <w:r>
+        <w:t>3.5. Administrar actividades turísticas</w:t>
+      </w:r>
+    </w:p>
+    <w:p>
+      <w:r>
+        <w:t>3.6. Administrar festividades y su programación</w:t>
+      </w:r>
+    </w:p>
+    <w:p>
+      <w:r>
+        <w:t>3.7. Consultar y descargar reportes administrativos</w:t>
+      </w:r>
+    </w:p>
+    <w:p>
+      <w:r>
+        <w:t>3.8. Consideraciones sobre la gestión de usuarios</w:t>
       </w:r>
     </w:p>
     <w:p>
@@ -278,7 +252,73 @@
         <w:pStyle w:val="Heading2"/>
       </w:pPr>
       <w:r>
-        <w:t>6. Problemas frecuentes y cierre</w:t>
+        <w:t>Guía de uso · 4. Manual del emprendimiento</w:t>
+      </w:r>
+    </w:p>
+    <w:p>
+      <w:r>
+        <w:t>4.1. Consultar el panel del emprendimiento</w:t>
+      </w:r>
+    </w:p>
+    <w:p>
+      <w:r>
+        <w:t>4.2. Configurar los tipos de servicio</w:t>
+      </w:r>
+    </w:p>
+    <w:p>
+      <w:r>
+        <w:t>4.3. Crear servicios por categoría</w:t>
+      </w:r>
+    </w:p>
+    <w:p>
+      <w:r>
+        <w:t>4.4. Editar servicios y gestionar imágenes</w:t>
+      </w:r>
+    </w:p>
+    <w:p>
+      <w:r>
+        <w:t>4.5. Revisar solicitudes y confirmar reservas</w:t>
+      </w:r>
+    </w:p>
+    <w:p>
+      <w:r>
+        <w:t>4.6. Revisar pagos y reagendar</w:t>
+      </w:r>
+    </w:p>
+    <w:p>
+      <w:r>
+        <w:t>4.7. Crear una reserva para un turista registrado</w:t>
+      </w:r>
+    </w:p>
+    <w:p>
+      <w:r>
+        <w:t>4.8. Consultar y descargar reportes del emprendimiento</w:t>
+      </w:r>
+    </w:p>
+    <w:p>
+      <w:r>
+        <w:t>4.9. Actualizar el perfil y las cuentas bancarias</w:t>
+      </w:r>
+    </w:p>
+    <w:p>
+      <w:pPr>
+        <w:pStyle w:val="Heading2"/>
+      </w:pPr>
+      <w:r>
+        <w:t>Guía de uso · 5. Configuración de la cuenta y ayuda</w:t>
+      </w:r>
+    </w:p>
+    <w:p>
+      <w:r>
+        <w:t>5.1. Mantener tu perfil y proteger el acceso</w:t>
+      </w:r>
+    </w:p>
+    <w:p>
+      <w:pPr>
+        <w:pStyle w:val="Heading2"/>
+      </w:pPr>
+      <w:r>
+        <w:t>Guía de uso · 6. Problemas frecuentes y cierre</w:t>
       </w:r>
     </w:p>
     <w:p>
@@ -306,7 +346,107 @@
         <w:pStyle w:val="Heading1"/>
       </w:pPr>
       <w:r>
-        <w:t>1. Introducción y acceso</w:t>
+        <w:t>¿Qué es Explora Candelaria?</w:t>
+      </w:r>
+    </w:p>
+    <w:p>
+      <w:r>
+        <w:t>Explora Candelaria es un sistema web que reúne información turística de La Candelaria y permite consultar establecimientos y solicitar reservas de sus servicios. Las personas pueden explorar sitios turísticos, actividades y festividades; los turistas registrados pueden reservar y dar seguimiento a sus solicitudes. La administración mantiene la información turística y los emprendimientos gestionan su oferta y sus reservas.</w:t>
+      </w:r>
+    </w:p>
+    <w:p>
+      <w:r>
+        <w:br w:type="page"/>
+      </w:r>
+    </w:p>
+    <w:p>
+      <w:pPr>
+        <w:pStyle w:val="Heading1"/>
+      </w:pPr>
+      <w:r>
+        <w:t>Características del sistema</w:t>
+      </w:r>
+    </w:p>
+    <w:p>
+      <w:r>
+        <w:t>El sistema organiza sus funciones según el rol de la cuenta. Las siguientes características corresponden a la rama Rama-Daniela, utilizada como referencia para este manual.</w:t>
+      </w:r>
+    </w:p>
+    <w:p>
+      <w:pPr>
+        <w:pStyle w:val="Heading2"/>
+      </w:pPr>
+      <w:r>
+        <w:t>Funciones disponibles</w:t>
+      </w:r>
+    </w:p>
+    <w:p>
+      <w:r>
+        <w:t>Las principales funciones son:</w:t>
+      </w:r>
+    </w:p>
+    <w:p>
+      <w:r>
+        <w:t>1. Consulta pública de sitios turísticos, actividades, festividades y mapa turístico.</w:t>
+      </w:r>
+    </w:p>
+    <w:p>
+      <w:r>
+        <w:t>2. Búsqueda de emprendimientos y servicios por categoría.</w:t>
+      </w:r>
+    </w:p>
+    <w:p>
+      <w:r>
+        <w:t>3. Registro de turistas con confirmación de correo y acceso a su historial.</w:t>
+      </w:r>
+    </w:p>
+    <w:p>
+      <w:r>
+        <w:t>4. Solicitud de reservas con selección de fechas, cantidades y carrito.</w:t>
+      </w:r>
+    </w:p>
+    <w:p>
+      <w:r>
+        <w:t>5. Envío y revisión de imágenes de comprobantes de pago.</w:t>
+      </w:r>
+    </w:p>
+    <w:p>
+      <w:r>
+        <w:t>6. Administración de emprendimientos y publicaciones turísticas.</w:t>
+      </w:r>
+    </w:p>
+    <w:p>
+      <w:r>
+        <w:t>7. Gestión de servicios, reservas, información comercial y datos de pago del emprendimiento.</w:t>
+      </w:r>
+    </w:p>
+    <w:p>
+      <w:r>
+        <w:t>8. Consulta y descarga de reportes según el rol.</w:t>
+      </w:r>
+    </w:p>
+    <w:p>
+      <w:r>
+        <w:rPr>
+          <w:b/>
+        </w:rPr>
+        <w:t xml:space="preserve">Resultado esperado: </w:t>
+      </w:r>
+      <w:r>
+        <w:t>Cada usuario dispone de los módulos correspondientes a su cuenta.</w:t>
+      </w:r>
+    </w:p>
+    <w:p>
+      <w:r>
+        <w:br w:type="page"/>
+      </w:r>
+    </w:p>
+    <w:p>
+      <w:pPr>
+        <w:pStyle w:val="Heading1"/>
+      </w:pPr>
+      <w:r>
+        <w:t>Guía de uso · 1. Introducción y acceso</w:t>
       </w:r>
     </w:p>
     <w:p>
@@ -473,7 +613,7 @@
         <w:pStyle w:val="Caption"/>
       </w:pPr>
       <w:r>
-        <w:t>Figura 1. Formulario de acceso con correo, contraseña, recuperación de contraseña y botón de inicio de sesión. Captura real con datos de demostración.</w:t>
+        <w:t>Imagen 1: Formulario de acceso con correo, contraseña, recuperación de contraseña y botón de inicio de sesión. Captura real con datos de demostración.</w:t>
       </w:r>
     </w:p>
     <w:p>
@@ -563,7 +703,7 @@
         <w:pStyle w:val="Heading1"/>
       </w:pPr>
       <w:r>
-        <w:t>2. Manual del turista</w:t>
+        <w:t>Guía de uso · 2. Manual del turista</w:t>
       </w:r>
     </w:p>
     <w:p>
@@ -677,7 +817,7 @@
         <w:pStyle w:val="Caption"/>
       </w:pPr>
       <w:r>
-        <w:t>Figura 2. Formulario de registro completo, incluyendo los campos personales, la contraseña y su confirmación. Captura real con datos de demostración.</w:t>
+        <w:t>Imagen 2: Formulario de registro completo, incluyendo los campos personales, la contraseña y su confirmación. Captura real con datos de demostración.</w:t>
       </w:r>
     </w:p>
     <w:p>
@@ -1260,7 +1400,7 @@
         <w:pStyle w:val="Heading1"/>
       </w:pPr>
       <w:r>
-        <w:t>3. Manual del administrador</w:t>
+        <w:t>Guía de uso · 3. Manual del administrador</w:t>
       </w:r>
     </w:p>
     <w:p>
@@ -1353,7 +1493,7 @@
         <w:pStyle w:val="Caption"/>
       </w:pPr>
       <w:r>
-        <w:t>Figura 3. Panel administrativo con los indicadores disponibles y el menú lateral completo. Captura real con datos de demostración.</w:t>
+        <w:t>Imagen 3: Panel administrativo con los indicadores disponibles y el menú lateral completo. Captura real con datos de demostración.</w:t>
       </w:r>
     </w:p>
     <w:p>
@@ -1467,7 +1607,7 @@
         <w:pStyle w:val="Caption"/>
       </w:pPr>
       <w:r>
-        <w:t>Figura 4. Asistente Nuevo Emprendimiento con las etapas Datos Personales, Perfil del Emprendimiento y Resumen Final. Captura real con datos de demostración.</w:t>
+        <w:t>Imagen 4: Asistente Nuevo Emprendimiento con las etapas Datos Personales, Perfil del Emprendimiento y Resumen Final. Captura real con datos de demostración.</w:t>
       </w:r>
     </w:p>
     <w:p>
@@ -1581,7 +1721,7 @@
         <w:pStyle w:val="Caption"/>
       </w:pPr>
       <w:r>
-        <w:t>Figura 5. Listado de emprendimientos con filtros, estado y acciones de detalle, edición y eliminación. Captura real con datos de demostración.</w:t>
+        <w:t>Imagen 5: Listado de emprendimientos con filtros, estado y acciones de detalle, edición y eliminación. Captura real con datos de demostración.</w:t>
       </w:r>
     </w:p>
     <w:p>
@@ -1695,7 +1835,7 @@
         <w:pStyle w:val="Caption"/>
       </w:pPr>
       <w:r>
-        <w:t>Figura 6. Gestión de sitios turísticos con tarjetas o filas, acciones de edición y galería. Captura real con datos de demostración.</w:t>
+        <w:t>Imagen 6: Pantalla de gestión de sitios turísticos con el control para agregar un sitio. Captura real con datos de demostración.</w:t>
       </w:r>
     </w:p>
     <w:p>
@@ -1793,7 +1933,7 @@
         <w:pStyle w:val="Caption"/>
       </w:pPr>
       <w:r>
-        <w:t>Figura 7. Gestión de actividades turísticas y, como complemento, formulario de nueva actividad con duración, dificultad y recomendaciones. Captura real con datos de demostración.</w:t>
+        <w:t>Imagen 7: Pantalla de gestión de actividades turísticas con el control para agregar una actividad. Captura real con datos de demostración.</w:t>
       </w:r>
     </w:p>
     <w:p>
@@ -1896,7 +2036,7 @@
         <w:pStyle w:val="Caption"/>
       </w:pPr>
       <w:r>
-        <w:t>Figura 8. Gestión de festividades con calendario o listado y la programación de actividades de una festividad seleccionada. Captura real con datos de demostración.</w:t>
+        <w:t>Imagen 8: Pantalla de gestión de festividades y sus controles disponibles. Captura real con datos de demostración.</w:t>
       </w:r>
     </w:p>
     <w:p>
@@ -2005,7 +2145,7 @@
         <w:pStyle w:val="Caption"/>
       </w:pPr>
       <w:r>
-        <w:t>Figura 9. Pantalla de reportes administrativos con las opciones por módulo, los totales y el botón de PDF. Captura real con datos de demostración.</w:t>
+        <w:t>Imagen 9: Pantalla de reportes administrativos con las opciones por módulo, los totales y el botón de PDF. Captura real con datos de demostración.</w:t>
       </w:r>
     </w:p>
     <w:p>
@@ -2090,7 +2230,7 @@
         <w:pStyle w:val="Heading1"/>
       </w:pPr>
       <w:r>
-        <w:t>4. Manual del emprendimiento</w:t>
+        <w:t>Guía de uso · 4. Manual del emprendimiento</w:t>
       </w:r>
     </w:p>
     <w:p>
@@ -2183,7 +2323,7 @@
         <w:pStyle w:val="Caption"/>
       </w:pPr>
       <w:r>
-        <w:t>Figura 10. Panel del emprendimiento con sus indicadores y los accesos a Servicios, Reservas y Reportes. Captura real con datos de demostración.</w:t>
+        <w:t>Imagen 10: Panel del emprendimiento con sus indicadores y los accesos a Servicios, Reservas y Reportes. Captura real con datos de demostración.</w:t>
       </w:r>
     </w:p>
     <w:p>
@@ -2292,7 +2432,7 @@
         <w:pStyle w:val="Caption"/>
       </w:pPr>
       <w:r>
-        <w:t>Figura 11. Selector de tipos de servicio con una o varias tarjetas marcadas y el botón Guardar. Captura real con datos de demostración.</w:t>
+        <w:t>Imagen 11: Selector de tipos de servicio con una o varias tarjetas marcadas y el botón Guardar. Captura real con datos de demostración.</w:t>
       </w:r>
     </w:p>
     <w:p>
@@ -2401,7 +2541,7 @@
         <w:pStyle w:val="Caption"/>
       </w:pPr>
       <w:r>
-        <w:t>Figura 12. Gestión de Servicios en la categoría Hospedaje, con una habitación ficticia y el botón para crear otro servicio. Captura real con datos de demostración.</w:t>
+        <w:t>Imagen 12: Gestión de Servicios en la categoría Hospedaje, con una habitación ficticia y el botón para crear otro servicio. Captura real con datos de demostración.</w:t>
       </w:r>
     </w:p>
     <w:p>
@@ -2515,7 +2655,7 @@
         <w:pStyle w:val="Caption"/>
       </w:pPr>
       <w:r>
-        <w:t>Figura 13. Formulario real de nuevo hospedaje como referencia de los campos del servicio. Pendiente: detalle de servicio y Gestor de Galería con imágenes de demostración. Captura real con datos de demostración.</w:t>
+        <w:t>Imagen 13: Formulario real de nuevo hospedaje como referencia de los campos del servicio. Pendiente: detalle de servicio y Gestor de Galería con imágenes de demostración. Captura real con datos de demostración.</w:t>
       </w:r>
     </w:p>
     <w:p>
@@ -2618,7 +2758,7 @@
         <w:pStyle w:val="Caption"/>
       </w:pPr>
       <w:r>
-        <w:t>Figura 14. Gestión de Reservas con filtros y solicitudes de demostración; complemento: detalle de una Pendiente con Confirmar reserva. Captura real con datos de demostración.</w:t>
+        <w:t>Imagen 14: Gestión de Reservas con filtros y solicitudes de demostración; complemento: detalle de una Pendiente con Confirmar reserva. Captura real con datos de demostración.</w:t>
       </w:r>
     </w:p>
     <w:p>
@@ -2732,7 +2872,7 @@
         <w:pStyle w:val="Caption"/>
       </w:pPr>
       <w:r>
-        <w:t>Figura 15. Detalle real de reserva en el panel del emprendimiento. Pendiente: comprobante en revisión y formulario de reagendamiento. Captura real con datos de demostración.</w:t>
+        <w:t>Imagen 15: Detalle real de reserva en el panel del emprendimiento. Pendiente: comprobante en revisión y formulario de reagendamiento. Captura real con datos de demostración.</w:t>
       </w:r>
     </w:p>
     <w:p>
@@ -2846,7 +2986,7 @@
         <w:pStyle w:val="Caption"/>
       </w:pPr>
       <w:r>
-        <w:t>Figura 16. Asistente de Nueva Reserva con búsqueda de servicios, carrito y los pasos de datos del turista y resumen. Captura real con datos de demostración.</w:t>
+        <w:t>Imagen 16: Asistente de Nueva Reserva con búsqueda de servicios, carrito y los pasos de datos del turista y resumen. Captura real con datos de demostración.</w:t>
       </w:r>
     </w:p>
     <w:p>
@@ -2960,7 +3100,7 @@
         <w:pStyle w:val="Caption"/>
       </w:pPr>
       <w:r>
-        <w:t>Figura 17. Reporte del emprendimiento con filtros de fechas, categoría, estado y los controles de descarga. Captura real con datos de demostración.</w:t>
+        <w:t>Imagen 17: Reporte del emprendimiento con filtros de fechas, categoría, estado y los controles de descarga. Captura real con datos de demostración.</w:t>
       </w:r>
     </w:p>
     <w:p>
@@ -3074,7 +3214,7 @@
         <w:pStyle w:val="Caption"/>
       </w:pPr>
       <w:r>
-        <w:t>Figura 18. Datos de pago con banco, número de cuenta y titular ficticios, más los controles Agregar cuenta y Guardar cambios. Captura real con datos de demostración.</w:t>
+        <w:t>Imagen 18: Datos de pago con banco, número de cuenta y titular ficticios, más los controles Agregar cuenta y Guardar cambios. Captura real con datos de demostración.</w:t>
       </w:r>
     </w:p>
     <w:p>
@@ -3087,7 +3227,7 @@
         <w:pStyle w:val="Heading1"/>
       </w:pPr>
       <w:r>
-        <w:t>5. Configuración de la cuenta y ayuda</w:t>
+        <w:t>Guía de uso · 5. Configuración de la cuenta y ayuda</w:t>
       </w:r>
     </w:p>
     <w:p>
@@ -3190,7 +3330,7 @@
         <w:pStyle w:val="Heading1"/>
       </w:pPr>
       <w:r>
-        <w:t>6. Problemas frecuentes y cierre</w:t>
+        <w:t>Guía de uso · 6. Problemas frecuentes y cierre</w:t>
       </w:r>
     </w:p>
     <w:p>
@@ -3213,13 +3353,13 @@
         <w:tblLook w:firstColumn="1" w:firstRow="1" w:lastColumn="0" w:lastRow="0" w:noHBand="0" w:noVBand="1" w:val="04A0"/>
       </w:tblPr>
       <w:tblGrid>
-        <w:gridCol w:w="4946"/>
-        <w:gridCol w:w="4946"/>
+        <w:gridCol w:w="4932"/>
+        <w:gridCol w:w="4932"/>
       </w:tblGrid>
       <w:tr>
         <w:tc>
           <w:tcPr>
-            <w:tcW w:type="dxa" w:w="4946"/>
+            <w:tcW w:type="dxa" w:w="4932"/>
           </w:tcPr>
           <w:p>
             <w:r>
@@ -3229,7 +3369,7 @@
         </w:tc>
         <w:tc>
           <w:tcPr>
-            <w:tcW w:type="dxa" w:w="4946"/>
+            <w:tcW w:type="dxa" w:w="4932"/>
           </w:tcPr>
           <w:p>
             <w:r>
@@ -3241,7 +3381,7 @@
       <w:tr>
         <w:tc>
           <w:tcPr>
-            <w:tcW w:type="dxa" w:w="4946"/>
+            <w:tcW w:type="dxa" w:w="4932"/>
           </w:tcPr>
           <w:p>
             <w:r>
@@ -3251,7 +3391,7 @@
         </w:tc>
         <w:tc>
           <w:tcPr>
-            <w:tcW w:type="dxa" w:w="4946"/>
+            <w:tcW w:type="dxa" w:w="4932"/>
           </w:tcPr>
           <w:p>
             <w:r>
@@ -3263,7 +3403,7 @@
       <w:tr>
         <w:tc>
           <w:tcPr>
-            <w:tcW w:type="dxa" w:w="4946"/>
+            <w:tcW w:type="dxa" w:w="4932"/>
           </w:tcPr>
           <w:p>
             <w:r>
@@ -3273,7 +3413,7 @@
         </w:tc>
         <w:tc>
           <w:tcPr>
-            <w:tcW w:type="dxa" w:w="4946"/>
+            <w:tcW w:type="dxa" w:w="4932"/>
           </w:tcPr>
           <w:p>
             <w:r>
@@ -3285,7 +3425,7 @@
       <w:tr>
         <w:tc>
           <w:tcPr>
-            <w:tcW w:type="dxa" w:w="4946"/>
+            <w:tcW w:type="dxa" w:w="4932"/>
           </w:tcPr>
           <w:p>
             <w:r>
@@ -3295,7 +3435,7 @@
         </w:tc>
         <w:tc>
           <w:tcPr>
-            <w:tcW w:type="dxa" w:w="4946"/>
+            <w:tcW w:type="dxa" w:w="4932"/>
           </w:tcPr>
           <w:p>
             <w:r>
@@ -3307,7 +3447,7 @@
       <w:tr>
         <w:tc>
           <w:tcPr>
-            <w:tcW w:type="dxa" w:w="4946"/>
+            <w:tcW w:type="dxa" w:w="4932"/>
           </w:tcPr>
           <w:p>
             <w:r>
@@ -3317,7 +3457,7 @@
         </w:tc>
         <w:tc>
           <w:tcPr>
-            <w:tcW w:type="dxa" w:w="4946"/>
+            <w:tcW w:type="dxa" w:w="4932"/>
           </w:tcPr>
           <w:p>
             <w:r>
@@ -3329,7 +3469,7 @@
       <w:tr>
         <w:tc>
           <w:tcPr>
-            <w:tcW w:type="dxa" w:w="4946"/>
+            <w:tcW w:type="dxa" w:w="4932"/>
           </w:tcPr>
           <w:p>
             <w:r>
@@ -3339,7 +3479,7 @@
         </w:tc>
         <w:tc>
           <w:tcPr>
-            <w:tcW w:type="dxa" w:w="4946"/>
+            <w:tcW w:type="dxa" w:w="4932"/>
           </w:tcPr>
           <w:p>
             <w:r>
@@ -3351,7 +3491,7 @@
       <w:tr>
         <w:tc>
           <w:tcPr>
-            <w:tcW w:type="dxa" w:w="4946"/>
+            <w:tcW w:type="dxa" w:w="4932"/>
           </w:tcPr>
           <w:p>
             <w:r>
@@ -3361,7 +3501,7 @@
         </w:tc>
         <w:tc>
           <w:tcPr>
-            <w:tcW w:type="dxa" w:w="4946"/>
+            <w:tcW w:type="dxa" w:w="4932"/>
           </w:tcPr>
           <w:p>
             <w:r>
@@ -3373,7 +3513,7 @@
       <w:tr>
         <w:tc>
           <w:tcPr>
-            <w:tcW w:type="dxa" w:w="4946"/>
+            <w:tcW w:type="dxa" w:w="4932"/>
           </w:tcPr>
           <w:p>
             <w:r>
@@ -3383,7 +3523,7 @@
         </w:tc>
         <w:tc>
           <w:tcPr>
-            <w:tcW w:type="dxa" w:w="4946"/>
+            <w:tcW w:type="dxa" w:w="4932"/>
           </w:tcPr>
           <w:p>
             <w:r>
@@ -3395,7 +3535,7 @@
       <w:tr>
         <w:tc>
           <w:tcPr>
-            <w:tcW w:type="dxa" w:w="4946"/>
+            <w:tcW w:type="dxa" w:w="4932"/>
           </w:tcPr>
           <w:p>
             <w:r>
@@ -3405,7 +3545,7 @@
         </w:tc>
         <w:tc>
           <w:tcPr>
-            <w:tcW w:type="dxa" w:w="4946"/>
+            <w:tcW w:type="dxa" w:w="4932"/>
           </w:tcPr>
           <w:p>
             <w:r>
@@ -3417,7 +3557,7 @@
       <w:tr>
         <w:tc>
           <w:tcPr>
-            <w:tcW w:type="dxa" w:w="4946"/>
+            <w:tcW w:type="dxa" w:w="4932"/>
           </w:tcPr>
           <w:p>
             <w:r>
@@ -3427,7 +3567,7 @@
         </w:tc>
         <w:tc>
           <w:tcPr>
-            <w:tcW w:type="dxa" w:w="4946"/>
+            <w:tcW w:type="dxa" w:w="4932"/>
           </w:tcPr>
           <w:p>
             <w:r>
@@ -3439,7 +3579,7 @@
       <w:tr>
         <w:tc>
           <w:tcPr>
-            <w:tcW w:type="dxa" w:w="4946"/>
+            <w:tcW w:type="dxa" w:w="4932"/>
           </w:tcPr>
           <w:p>
             <w:r>
@@ -3449,7 +3589,7 @@
         </w:tc>
         <w:tc>
           <w:tcPr>
-            <w:tcW w:type="dxa" w:w="4946"/>
+            <w:tcW w:type="dxa" w:w="4932"/>
           </w:tcPr>
           <w:p>
             <w:r>
@@ -3461,7 +3601,7 @@
       <w:tr>
         <w:tc>
           <w:tcPr>
-            <w:tcW w:type="dxa" w:w="4946"/>
+            <w:tcW w:type="dxa" w:w="4932"/>
           </w:tcPr>
           <w:p>
             <w:r>
@@ -3471,7 +3611,7 @@
         </w:tc>
         <w:tc>
           <w:tcPr>
-            <w:tcW w:type="dxa" w:w="4946"/>
+            <w:tcW w:type="dxa" w:w="4932"/>
           </w:tcPr>
           <w:p>
             <w:r>
@@ -3483,7 +3623,7 @@
       <w:tr>
         <w:tc>
           <w:tcPr>
-            <w:tcW w:type="dxa" w:w="4946"/>
+            <w:tcW w:type="dxa" w:w="4932"/>
           </w:tcPr>
           <w:p>
             <w:r>
@@ -3493,7 +3633,7 @@
         </w:tc>
         <w:tc>
           <w:tcPr>
-            <w:tcW w:type="dxa" w:w="4946"/>
+            <w:tcW w:type="dxa" w:w="4932"/>
           </w:tcPr>
           <w:p>
             <w:r>
@@ -3505,7 +3645,7 @@
       <w:tr>
         <w:tc>
           <w:tcPr>
-            <w:tcW w:type="dxa" w:w="4946"/>
+            <w:tcW w:type="dxa" w:w="4932"/>
           </w:tcPr>
           <w:p>
             <w:r>
@@ -3515,7 +3655,7 @@
         </w:tc>
         <w:tc>
           <w:tcPr>
-            <w:tcW w:type="dxa" w:w="4946"/>
+            <w:tcW w:type="dxa" w:w="4932"/>
           </w:tcPr>
           <w:p>
             <w:r>
@@ -3545,14 +3685,14 @@
         <w:tblLook w:firstColumn="1" w:firstRow="1" w:lastColumn="0" w:lastRow="0" w:noHBand="0" w:noVBand="1" w:val="04A0"/>
       </w:tblPr>
       <w:tblGrid>
-        <w:gridCol w:w="3298"/>
-        <w:gridCol w:w="3298"/>
-        <w:gridCol w:w="3298"/>
+        <w:gridCol w:w="3288"/>
+        <w:gridCol w:w="3288"/>
+        <w:gridCol w:w="3288"/>
       </w:tblGrid>
       <w:tr>
         <w:tc>
           <w:tcPr>
-            <w:tcW w:type="dxa" w:w="3298"/>
+            <w:tcW w:type="dxa" w:w="3288"/>
           </w:tcPr>
           <w:p>
             <w:r>
@@ -3562,7 +3702,7 @@
         </w:tc>
         <w:tc>
           <w:tcPr>
-            <w:tcW w:type="dxa" w:w="3298"/>
+            <w:tcW w:type="dxa" w:w="3288"/>
           </w:tcPr>
           <w:p>
             <w:r>
@@ -3572,7 +3712,7 @@
         </w:tc>
         <w:tc>
           <w:tcPr>
-            <w:tcW w:type="dxa" w:w="3298"/>
+            <w:tcW w:type="dxa" w:w="3288"/>
           </w:tcPr>
           <w:p>
             <w:r>
@@ -3584,7 +3724,7 @@
       <w:tr>
         <w:tc>
           <w:tcPr>
-            <w:tcW w:type="dxa" w:w="3298"/>
+            <w:tcW w:type="dxa" w:w="3288"/>
           </w:tcPr>
           <w:p>
             <w:r>
@@ -3594,7 +3734,7 @@
         </w:tc>
         <w:tc>
           <w:tcPr>
-            <w:tcW w:type="dxa" w:w="3298"/>
+            <w:tcW w:type="dxa" w:w="3288"/>
           </w:tcPr>
           <w:p>
             <w:r>
@@ -3604,7 +3744,7 @@
         </w:tc>
         <w:tc>
           <w:tcPr>
-            <w:tcW w:type="dxa" w:w="3298"/>
+            <w:tcW w:type="dxa" w:w="3288"/>
           </w:tcPr>
           <w:p>
             <w:r>
@@ -3616,7 +3756,7 @@
       <w:tr>
         <w:tc>
           <w:tcPr>
-            <w:tcW w:type="dxa" w:w="3298"/>
+            <w:tcW w:type="dxa" w:w="3288"/>
           </w:tcPr>
           <w:p>
             <w:r>
@@ -3626,7 +3766,7 @@
         </w:tc>
         <w:tc>
           <w:tcPr>
-            <w:tcW w:type="dxa" w:w="3298"/>
+            <w:tcW w:type="dxa" w:w="3288"/>
           </w:tcPr>
           <w:p>
             <w:r>
@@ -3636,7 +3776,7 @@
         </w:tc>
         <w:tc>
           <w:tcPr>
-            <w:tcW w:type="dxa" w:w="3298"/>
+            <w:tcW w:type="dxa" w:w="3288"/>
           </w:tcPr>
           <w:p>
             <w:r>
@@ -3648,7 +3788,7 @@
       <w:tr>
         <w:tc>
           <w:tcPr>
-            <w:tcW w:type="dxa" w:w="3298"/>
+            <w:tcW w:type="dxa" w:w="3288"/>
           </w:tcPr>
           <w:p>
             <w:r>
@@ -3658,7 +3798,7 @@
         </w:tc>
         <w:tc>
           <w:tcPr>
-            <w:tcW w:type="dxa" w:w="3298"/>
+            <w:tcW w:type="dxa" w:w="3288"/>
           </w:tcPr>
           <w:p>
             <w:r>
@@ -3668,7 +3808,7 @@
         </w:tc>
         <w:tc>
           <w:tcPr>
-            <w:tcW w:type="dxa" w:w="3298"/>
+            <w:tcW w:type="dxa" w:w="3288"/>
           </w:tcPr>
           <w:p>
             <w:r>
@@ -3680,7 +3820,7 @@
       <w:tr>
         <w:tc>
           <w:tcPr>
-            <w:tcW w:type="dxa" w:w="3298"/>
+            <w:tcW w:type="dxa" w:w="3288"/>
           </w:tcPr>
           <w:p>
             <w:r>
@@ -3690,7 +3830,7 @@
         </w:tc>
         <w:tc>
           <w:tcPr>
-            <w:tcW w:type="dxa" w:w="3298"/>
+            <w:tcW w:type="dxa" w:w="3288"/>
           </w:tcPr>
           <w:p>
             <w:r>
@@ -3700,7 +3840,7 @@
         </w:tc>
         <w:tc>
           <w:tcPr>
-            <w:tcW w:type="dxa" w:w="3298"/>
+            <w:tcW w:type="dxa" w:w="3288"/>
           </w:tcPr>
           <w:p>
             <w:r>
@@ -3712,7 +3852,7 @@
       <w:tr>
         <w:tc>
           <w:tcPr>
-            <w:tcW w:type="dxa" w:w="3298"/>
+            <w:tcW w:type="dxa" w:w="3288"/>
           </w:tcPr>
           <w:p>
             <w:r>
@@ -3722,7 +3862,7 @@
         </w:tc>
         <w:tc>
           <w:tcPr>
-            <w:tcW w:type="dxa" w:w="3298"/>
+            <w:tcW w:type="dxa" w:w="3288"/>
           </w:tcPr>
           <w:p>
             <w:r>
@@ -3732,7 +3872,7 @@
         </w:tc>
         <w:tc>
           <w:tcPr>
-            <w:tcW w:type="dxa" w:w="3298"/>
+            <w:tcW w:type="dxa" w:w="3288"/>
           </w:tcPr>
           <w:p>
             <w:r>
@@ -3744,7 +3884,7 @@
       <w:tr>
         <w:tc>
           <w:tcPr>
-            <w:tcW w:type="dxa" w:w="3298"/>
+            <w:tcW w:type="dxa" w:w="3288"/>
           </w:tcPr>
           <w:p>
             <w:r>
@@ -3754,7 +3894,7 @@
         </w:tc>
         <w:tc>
           <w:tcPr>
-            <w:tcW w:type="dxa" w:w="3298"/>
+            <w:tcW w:type="dxa" w:w="3288"/>
           </w:tcPr>
           <w:p>
             <w:r>
@@ -3764,7 +3904,7 @@
         </w:tc>
         <w:tc>
           <w:tcPr>
-            <w:tcW w:type="dxa" w:w="3298"/>
+            <w:tcW w:type="dxa" w:w="3288"/>
           </w:tcPr>
           <w:p>
             <w:r>
@@ -3804,11 +3944,6 @@
     </w:p>
     <w:p>
       <w:r>
-        <w:t>La plantilla Design Report enlazada y la aplicación Documents no estaban accesibles en esta sesión. Se preparó un diseño propio de manual en Word editable y PDF; no se atribuye a la plantilla solicitada.</w:t>
-      </w:r>
-    </w:p>
-    <w:p>
-      <w:r>
         <w:t>Observación sobre pagos: el detalle del emprendimiento contiene un aviso de aprobación a las 12 horas, mientras ReservaService contempla aprobación tras 24 horas y alerta a las 23. La ejecución automática depende además de cuándo se invoque el procesamiento. Se recomienda resolver esta diferencia antes de comunicar un plazo garantizado a los usuarios.</w:t>
       </w:r>
     </w:p>
@@ -3835,15 +3970,24 @@
     <w:p>
       <w:r>
         <w:t>Algunas vistas públicas dependen de cdn.tailwindcss.com, bloqueado en la red de esta sesión. Sus capturas sin estilos se descartaron; se incluyeron instrucciones para insertar imágenes fieles cuando ese recurso esté disponible.</w:t>
+      </w:r>
+    </w:p>
+    <w:p>
+      <w:r>
+        <w:t>Diseño adaptado del documento de referencia Manual de Usuario de Yumpu.pdf facilitado por el usuario: portada, presentación del sistema, características, guía de uso numerada y pies de imagen. El contenido y las pantallas corresponden a Explora Candelaria; no se incorporan funciones de Yumpu.</w:t>
       </w:r>
     </w:p>
     <w:sectPr>
       <w:headerReference w:type="default" r:id="rId9"/>
       <w:footerReference w:type="default" r:id="rId10"/>
-      <w:pgSz w:w="11909" w:h="16834"/>
-      <w:pgMar w:top="936" w:right="1008" w:bottom="936" w:left="1008" w:header="720" w:footer="720" w:gutter="0"/>
+      <w:pgSz w:w="12240" w:h="15840"/>
+      <w:pgMar w:top="936" w:right="936" w:bottom="936" w:left="1440" w:header="720" w:footer="720" w:gutter="0"/>
       <w:cols w:space="720"/>
+      <w:titlePg/>
       <w:docGrid w:linePitch="360"/>
+      <w:pgBorders w:offsetFrom="page">
+        <w:left w:val="single" w:sz="36" w:space="18" w:color="CDCAE9"/>
+      </w:pgBorders>
     </w:sectPr>
   </w:body>
 </w:document>
@@ -3856,7 +4000,7 @@
       <w:pStyle w:val="Footer"/>
     </w:pPr>
     <w:r>
-      <w:t xml:space="preserve">Rama-Daniela  ·  Edición 1.0                                      Página </w:t>
+      <w:t xml:space="preserve">Rama-Daniela  ·  Edición 2.0                                      Página </w:t>
     </w:r>
     <w:fldSimple w:instr="PAGE"/>
   </w:p>
@@ -4241,10 +4385,11 @@
     <w:rsid w:val="00FC693F"/>
     <w:pPr>
       <w:spacing w:after="100"/>
+      <w:jc w:val="both"/>
     </w:pPr>
     <w:rPr>
-      <w:rFonts w:ascii="Calibri" w:hAnsi="Calibri"/>
-      <w:sz w:val="20"/>
+      <w:rFonts w:ascii="Arial" w:hAnsi="Arial"/>
+      <w:sz w:val="21"/>
     </w:rPr>
   </w:style>
   <w:style w:type="paragraph" w:styleId="Header">
@@ -4306,7 +4451,7 @@
       <w:outlineLvl w:val="0"/>
     </w:pPr>
     <w:rPr>
-      <w:rFonts w:asciiTheme="majorHAnsi" w:eastAsiaTheme="majorEastAsia" w:hAnsiTheme="majorHAnsi" w:cstheme="majorBidi" w:ascii="Calibri" w:hAnsi="Calibri"/>
+      <w:rFonts w:asciiTheme="majorHAnsi" w:eastAsiaTheme="majorEastAsia" w:hAnsiTheme="majorHAnsi" w:cstheme="majorBidi" w:ascii="Arial" w:hAnsi="Arial"/>
       <w:b/>
       <w:bCs/>
       <w:color w:val="075C45"/>
@@ -4330,7 +4475,7 @@
       <w:outlineLvl w:val="1"/>
     </w:pPr>
     <w:rPr>
-      <w:rFonts w:asciiTheme="majorHAnsi" w:eastAsiaTheme="majorEastAsia" w:hAnsiTheme="majorHAnsi" w:cstheme="majorBidi" w:ascii="Calibri" w:hAnsi="Calibri"/>
+      <w:rFonts w:asciiTheme="majorHAnsi" w:eastAsiaTheme="majorEastAsia" w:hAnsiTheme="majorHAnsi" w:cstheme="majorBidi" w:ascii="Arial" w:hAnsi="Arial"/>
       <w:b/>
       <w:bCs/>
       <w:color w:val="075C45"/>
@@ -4354,7 +4499,7 @@
       <w:outlineLvl w:val="2"/>
     </w:pPr>
     <w:rPr>
-      <w:rFonts w:asciiTheme="majorHAnsi" w:eastAsiaTheme="majorEastAsia" w:hAnsiTheme="majorHAnsi" w:cstheme="majorBidi" w:ascii="Calibri" w:hAnsi="Calibri"/>
+      <w:rFonts w:asciiTheme="majorHAnsi" w:eastAsiaTheme="majorEastAsia" w:hAnsiTheme="majorHAnsi" w:cstheme="majorBidi" w:ascii="Arial" w:hAnsi="Arial"/>
       <w:b/>
       <w:bCs/>
       <w:color w:val="075C45"/>
@@ -4596,7 +4741,7 @@
       <w:contextualSpacing/>
     </w:pPr>
     <w:rPr>
-      <w:rFonts w:asciiTheme="majorHAnsi" w:eastAsiaTheme="majorEastAsia" w:hAnsiTheme="majorHAnsi" w:cstheme="majorBidi" w:ascii="Calibri" w:hAnsi="Calibri"/>
+      <w:rFonts w:asciiTheme="majorHAnsi" w:eastAsiaTheme="majorEastAsia" w:hAnsiTheme="majorHAnsi" w:cstheme="majorBidi" w:ascii="Arial" w:hAnsi="Arial"/>
       <w:color w:val="075C45"/>
       <w:spacing w:val="5"/>
       <w:kern w:val="28"/>
@@ -5036,10 +5181,13 @@
     <w:rsid w:val="00FC693F"/>
     <w:pPr>
       <w:spacing w:line="240" w:lineRule="auto"/>
+      <w:jc w:val="center"/>
     </w:pPr>
     <w:rPr>
+      <w:rFonts w:ascii="Arial" w:hAnsi="Arial"/>
       <w:b/>
       <w:bCs/>
+      <w:i/>
       <w:color w:val="4F81BD" w:themeColor="accent1"/>
       <w:sz w:val="18"/>
       <w:szCs w:val="18"/>

</xml_diff>